<commit_message>
fix(redline): M9 mid-review #1 triage — final-mark guard, structural verification, id ranges, anchor identity, schema tightening
</commit_message>
<xml_diff>
--- a/backend/src/test/resources/fixtures/m9-macro.docx
+++ b/backend/src/test/resources/fixtures/m9-macro.docx
@@ -23,6 +23,19 @@
         <w:t xml:space="preserve">Supplier liability shall be unlimited.</w:t>
       </w:r>
     </w:p>
+    <w:p>
+      <w:pPr>
+        <w:pStyle w:val="Heading1"/>
+      </w:pPr>
+      <w:r>
+        <w:t xml:space="preserve">2. Governing Law</w:t>
+      </w:r>
+    </w:p>
+    <w:p>
+      <w:r>
+        <w:t xml:space="preserve">This Agreement is governed by the laws of Delaware.</w:t>
+      </w:r>
+    </w:p>
     <w:sectPr/>
   </w:body>
 </w:document>

</xml_diff>